<commit_message>
Laravel-001 Added new versions of resume files
</commit_message>
<xml_diff>
--- a/public/documents/Sasa_Rakic_All_Languages_Resume.docx
+++ b/public/documents/Sasa_Rakic_All_Languages_Resume.docx
@@ -189,39 +189,14 @@
       </w:r>
       <w:r>
         <w:rPr>
-          <w:rFonts w:hint="default"/>
-          <w:lang w:val="en-US"/>
-        </w:rPr>
-        <w:fldChar w:fldCharType="begin"/>
-      </w:r>
-      <w:r>
-        <w:rPr>
-          <w:rFonts w:hint="default"/>
-          <w:lang w:val="en-US"/>
-        </w:rPr>
-        <w:instrText xml:space="preserve"> HYPERLINK "https://github.com/rakics" </w:instrText>
-      </w:r>
-      <w:r>
-        <w:rPr>
-          <w:rFonts w:hint="default"/>
-          <w:lang w:val="en-US"/>
-        </w:rPr>
-        <w:fldChar w:fldCharType="separate"/>
-      </w:r>
-      <w:r>
-        <w:rPr>
           <w:rStyle w:val="9"/>
-          <w:rFonts w:hint="default"/>
-          <w:lang w:val="en-US"/>
-        </w:rPr>
-        <w:t>https://github.com/rakics</w:t>
-      </w:r>
-      <w:r>
-        <w:rPr>
-          <w:rFonts w:hint="default"/>
-          <w:lang w:val="en-US"/>
-        </w:rPr>
-        <w:fldChar w:fldCharType="end"/>
+          <w:rFonts w:hint="default" w:ascii="Verdana" w:hAnsi="Verdana" w:eastAsia="Verdana"/>
+          <w:spacing w:val="0"/>
+          <w:position w:val="0"/>
+          <w:sz w:val="20"/>
+          <w:shd w:val="clear" w:color="auto" w:fill="auto"/>
+        </w:rPr>
+        <w:t>https://github.com/synergia-studio/</w:t>
       </w:r>
     </w:p>
     <w:p>
@@ -262,19 +237,10 @@
           <w:bCs/>
           <w:lang w:val="en-US"/>
         </w:rPr>
-        <w:t>Node JS</w:t>
+        <w:t>Node JS demo project:</w:t>
       </w:r>
       <w:bookmarkStart w:id="13" w:name="_GoBack"/>
       <w:bookmarkEnd w:id="13"/>
-      <w:r>
-        <w:rPr>
-          <w:rFonts w:hint="default"/>
-          <w:b/>
-          <w:bCs/>
-          <w:lang w:val="en-US"/>
-        </w:rPr>
-        <w:t xml:space="preserve"> demo project:</w:t>
-      </w:r>
     </w:p>
     <w:p>
       <w:pPr>

</xml_diff>